<commit_message>
Edited address subquestion, county updates
</commit_message>
<xml_diff>
--- a/docassemble/StalkingNoContactOrderRequest/data/templates/others_protected_addendum.docx
+++ b/docassemble/StalkingNoContactOrderRequest/data/templates/others_protected_addendum.docx
@@ -37,11 +37,26 @@
         </w:rPr>
         <w:t xml:space="preserve">if </w:t>
       </w:r>
-      <w:r>
-        <w:rPr>
-          <w:rFonts w:ascii="Arial" w:hAnsi="Arial" w:cs="Arial"/>
-        </w:rPr>
-        <w:t xml:space="preserve">trial_court.address.county </w:t>
+      <w:proofErr w:type="spellStart"/>
+      <w:r>
+        <w:rPr>
+          <w:rFonts w:ascii="Arial" w:hAnsi="Arial" w:cs="Arial"/>
+        </w:rPr>
+        <w:t>filing_</w:t>
+      </w:r>
+      <w:proofErr w:type="gramStart"/>
+      <w:r>
+        <w:rPr>
+          <w:rFonts w:ascii="Arial" w:hAnsi="Arial" w:cs="Arial"/>
+        </w:rPr>
+        <w:t>county</w:t>
+      </w:r>
+      <w:proofErr w:type="spellEnd"/>
+      <w:r>
+        <w:rPr>
+          <w:rFonts w:ascii="Arial" w:hAnsi="Arial" w:cs="Arial"/>
+        </w:rPr>
+        <w:t xml:space="preserve"> </w:t>
       </w:r>
       <w:r>
         <w:rPr>
@@ -49,6 +64,7 @@
         </w:rPr>
         <w:t>!</w:t>
       </w:r>
+      <w:proofErr w:type="gramEnd"/>
       <w:r>
         <w:rPr>
           <w:rFonts w:ascii="Arial" w:hAnsi="Arial" w:cs="Arial"/>
@@ -59,25 +75,53 @@
         <w:rPr>
           <w:rFonts w:ascii="Arial" w:hAnsi="Arial" w:cs="Arial"/>
         </w:rPr>
-        <w:t xml:space="preserve"> %}</w:t>
-      </w:r>
-      <w:r>
-        <w:rPr>
-          <w:rFonts w:ascii="Arial" w:hAnsi="Arial" w:cs="Arial"/>
-        </w:rPr>
-        <w:t xml:space="preserve">Other </w:t>
-      </w:r>
-      <w:r>
-        <w:rPr>
-          <w:rFonts w:ascii="Arial" w:hAnsi="Arial" w:cs="Arial"/>
-        </w:rPr>
-        <w:t>{% endif %}</w:t>
-      </w:r>
-      <w:r>
-        <w:rPr>
-          <w:rFonts w:ascii="Arial" w:hAnsi="Arial" w:cs="Arial"/>
-        </w:rPr>
-        <w:t>Protected Persons</w:t>
+        <w:t xml:space="preserve"> </w:t>
+      </w:r>
+      <w:proofErr w:type="gramStart"/>
+      <w:r>
+        <w:rPr>
+          <w:rFonts w:ascii="Arial" w:hAnsi="Arial" w:cs="Arial"/>
+        </w:rPr>
+        <w:t>%}</w:t>
+      </w:r>
+      <w:r>
+        <w:rPr>
+          <w:rFonts w:ascii="Arial" w:hAnsi="Arial" w:cs="Arial"/>
+        </w:rPr>
+        <w:t>Other</w:t>
+      </w:r>
+      <w:proofErr w:type="gramEnd"/>
+      <w:r>
+        <w:rPr>
+          <w:rFonts w:ascii="Arial" w:hAnsi="Arial" w:cs="Arial"/>
+        </w:rPr>
+        <w:t xml:space="preserve"> </w:t>
+      </w:r>
+      <w:r>
+        <w:rPr>
+          <w:rFonts w:ascii="Arial" w:hAnsi="Arial" w:cs="Arial"/>
+        </w:rPr>
+        <w:t xml:space="preserve">{% endif </w:t>
+      </w:r>
+      <w:proofErr w:type="gramStart"/>
+      <w:r>
+        <w:rPr>
+          <w:rFonts w:ascii="Arial" w:hAnsi="Arial" w:cs="Arial"/>
+        </w:rPr>
+        <w:t>%}</w:t>
+      </w:r>
+      <w:r>
+        <w:rPr>
+          <w:rFonts w:ascii="Arial" w:hAnsi="Arial" w:cs="Arial"/>
+        </w:rPr>
+        <w:t>Protected</w:t>
+      </w:r>
+      <w:proofErr w:type="gramEnd"/>
+      <w:r>
+        <w:rPr>
+          <w:rFonts w:ascii="Arial" w:hAnsi="Arial" w:cs="Arial"/>
+        </w:rPr>
+        <w:t xml:space="preserve"> Persons</w:t>
       </w:r>
     </w:p>
     <w:p>
@@ -108,11 +152,19 @@
         </w:rPr>
         <w:t xml:space="preserve">if </w:t>
       </w:r>
-      <w:r>
-        <w:rPr>
-          <w:rFonts w:ascii="Arial" w:hAnsi="Arial" w:cs="Arial"/>
-        </w:rPr>
-        <w:t xml:space="preserve">trial_court.address.county </w:t>
+      <w:proofErr w:type="spellStart"/>
+      <w:r>
+        <w:rPr>
+          <w:rFonts w:ascii="Arial" w:hAnsi="Arial" w:cs="Arial"/>
+        </w:rPr>
+        <w:t>filing_county</w:t>
+      </w:r>
+      <w:proofErr w:type="spellEnd"/>
+      <w:r>
+        <w:rPr>
+          <w:rFonts w:ascii="Arial" w:hAnsi="Arial" w:cs="Arial"/>
+        </w:rPr>
+        <w:t xml:space="preserve"> </w:t>
       </w:r>
       <w:r>
         <w:rPr>
@@ -130,31 +182,103 @@
         <w:rPr>
           <w:rFonts w:ascii="Arial" w:hAnsi="Arial" w:cs="Arial"/>
         </w:rPr>
-        <w:t xml:space="preserve"> %}P{% else %}</w:t>
-      </w:r>
-      <w:r>
-        <w:rPr>
-          <w:rFonts w:ascii="Arial" w:hAnsi="Arial" w:cs="Arial"/>
-        </w:rPr>
-        <w:t>Other p</w:t>
-      </w:r>
-      <w:r>
-        <w:rPr>
-          <w:rFonts w:ascii="Arial" w:hAnsi="Arial" w:cs="Arial"/>
-        </w:rPr>
-        <w:t>{% endif %}</w:t>
-      </w:r>
-      <w:r>
-        <w:rPr>
-          <w:rFonts w:ascii="Arial" w:hAnsi="Arial" w:cs="Arial"/>
-        </w:rPr>
-        <w:t>rotected persons (persons to be included in the Stalking No Contact Order)</w:t>
-      </w:r>
-      <w:r>
-        <w:rPr>
-          <w:rFonts w:ascii="Arial" w:hAnsi="Arial" w:cs="Arial"/>
-        </w:rPr>
-        <w:t xml:space="preserve">{% </w:t>
+        <w:t xml:space="preserve"> </w:t>
+      </w:r>
+      <w:proofErr w:type="gramStart"/>
+      <w:r>
+        <w:rPr>
+          <w:rFonts w:ascii="Arial" w:hAnsi="Arial" w:cs="Arial"/>
+        </w:rPr>
+        <w:t>%}P</w:t>
+      </w:r>
+      <w:proofErr w:type="gramEnd"/>
+      <w:r>
+        <w:rPr>
+          <w:rFonts w:ascii="Arial" w:hAnsi="Arial" w:cs="Arial"/>
+        </w:rPr>
+        <w:t xml:space="preserve">{% else </w:t>
+      </w:r>
+      <w:proofErr w:type="gramStart"/>
+      <w:r>
+        <w:rPr>
+          <w:rFonts w:ascii="Arial" w:hAnsi="Arial" w:cs="Arial"/>
+        </w:rPr>
+        <w:t>%}</w:t>
+      </w:r>
+      <w:r>
+        <w:rPr>
+          <w:rFonts w:ascii="Arial" w:hAnsi="Arial" w:cs="Arial"/>
+        </w:rPr>
+        <w:t>Other</w:t>
+      </w:r>
+      <w:proofErr w:type="gramEnd"/>
+      <w:r>
+        <w:rPr>
+          <w:rFonts w:ascii="Arial" w:hAnsi="Arial" w:cs="Arial"/>
+        </w:rPr>
+        <w:t xml:space="preserve"> </w:t>
+      </w:r>
+      <w:proofErr w:type="gramStart"/>
+      <w:r>
+        <w:rPr>
+          <w:rFonts w:ascii="Arial" w:hAnsi="Arial" w:cs="Arial"/>
+        </w:rPr>
+        <w:t>p</w:t>
+      </w:r>
+      <w:r>
+        <w:rPr>
+          <w:rFonts w:ascii="Arial" w:hAnsi="Arial" w:cs="Arial"/>
+        </w:rPr>
+        <w:t>{</w:t>
+      </w:r>
+      <w:proofErr w:type="gramEnd"/>
+      <w:r>
+        <w:rPr>
+          <w:rFonts w:ascii="Arial" w:hAnsi="Arial" w:cs="Arial"/>
+        </w:rPr>
+        <w:t xml:space="preserve">% endif </w:t>
+      </w:r>
+      <w:proofErr w:type="gramStart"/>
+      <w:r>
+        <w:rPr>
+          <w:rFonts w:ascii="Arial" w:hAnsi="Arial" w:cs="Arial"/>
+        </w:rPr>
+        <w:t>%}</w:t>
+      </w:r>
+      <w:proofErr w:type="spellStart"/>
+      <w:r>
+        <w:rPr>
+          <w:rFonts w:ascii="Arial" w:hAnsi="Arial" w:cs="Arial"/>
+        </w:rPr>
+        <w:t>rotected</w:t>
+      </w:r>
+      <w:proofErr w:type="spellEnd"/>
+      <w:proofErr w:type="gramEnd"/>
+      <w:r>
+        <w:rPr>
+          <w:rFonts w:ascii="Arial" w:hAnsi="Arial" w:cs="Arial"/>
+        </w:rPr>
+        <w:t xml:space="preserve"> persons (persons to be included in the Stalking No Contact </w:t>
+      </w:r>
+      <w:proofErr w:type="gramStart"/>
+      <w:r>
+        <w:rPr>
+          <w:rFonts w:ascii="Arial" w:hAnsi="Arial" w:cs="Arial"/>
+        </w:rPr>
+        <w:t>Order)</w:t>
+      </w:r>
+      <w:r>
+        <w:rPr>
+          <w:rFonts w:ascii="Arial" w:hAnsi="Arial" w:cs="Arial"/>
+        </w:rPr>
+        <w:t>{</w:t>
+      </w:r>
+      <w:proofErr w:type="gramEnd"/>
+      <w:r>
+        <w:rPr>
+          <w:rFonts w:ascii="Arial" w:hAnsi="Arial" w:cs="Arial"/>
+        </w:rPr>
+        <w:t xml:space="preserve">% </w:t>
       </w:r>
       <w:r>
         <w:rPr>
@@ -162,11 +286,26 @@
         </w:rPr>
         <w:t xml:space="preserve">if </w:t>
       </w:r>
-      <w:r>
-        <w:rPr>
-          <w:rFonts w:ascii="Arial" w:hAnsi="Arial" w:cs="Arial"/>
-        </w:rPr>
-        <w:t xml:space="preserve">trial_court.address.county </w:t>
+      <w:proofErr w:type="spellStart"/>
+      <w:r>
+        <w:rPr>
+          <w:rFonts w:ascii="Arial" w:hAnsi="Arial" w:cs="Arial"/>
+        </w:rPr>
+        <w:t>filing_</w:t>
+      </w:r>
+      <w:proofErr w:type="gramStart"/>
+      <w:r>
+        <w:rPr>
+          <w:rFonts w:ascii="Arial" w:hAnsi="Arial" w:cs="Arial"/>
+        </w:rPr>
+        <w:t>county</w:t>
+      </w:r>
+      <w:proofErr w:type="spellEnd"/>
+      <w:r>
+        <w:rPr>
+          <w:rFonts w:ascii="Arial" w:hAnsi="Arial" w:cs="Arial"/>
+        </w:rPr>
+        <w:t xml:space="preserve"> </w:t>
       </w:r>
       <w:r>
         <w:rPr>
@@ -174,6 +313,7 @@
         </w:rPr>
         <w:t>!</w:t>
       </w:r>
+      <w:proofErr w:type="gramEnd"/>
       <w:r>
         <w:rPr>
           <w:rFonts w:ascii="Arial" w:hAnsi="Arial" w:cs="Arial"/>
@@ -190,13 +330,27 @@
         <w:rPr>
           <w:rFonts w:ascii="Arial" w:hAnsi="Arial" w:cs="Arial"/>
         </w:rPr>
-        <w:t>, in addition to the petitioner and the first two protected persons,</w:t>
-      </w:r>
-      <w:r>
-        <w:rPr>
-          <w:rFonts w:ascii="Arial" w:hAnsi="Arial" w:cs="Arial"/>
-        </w:rPr>
-        <w:t>{% endif %}</w:t>
+        <w:t xml:space="preserve">, in addition to the petitioner and the first two protected </w:t>
+      </w:r>
+      <w:proofErr w:type="gramStart"/>
+      <w:r>
+        <w:rPr>
+          <w:rFonts w:ascii="Arial" w:hAnsi="Arial" w:cs="Arial"/>
+        </w:rPr>
+        <w:t>persons,</w:t>
+      </w:r>
+      <w:r>
+        <w:rPr>
+          <w:rFonts w:ascii="Arial" w:hAnsi="Arial" w:cs="Arial"/>
+        </w:rPr>
+        <w:t>{</w:t>
+      </w:r>
+      <w:proofErr w:type="gramEnd"/>
+      <w:r>
+        <w:rPr>
+          <w:rFonts w:ascii="Arial" w:hAnsi="Arial" w:cs="Arial"/>
+        </w:rPr>
+        <w:t>% endif %}</w:t>
       </w:r>
       <w:r>
         <w:rPr>
@@ -300,36 +454,76 @@
         </w:rPr>
         <w:t xml:space="preserve"> in </w:t>
       </w:r>
+      <w:proofErr w:type="spellStart"/>
       <w:r>
         <w:rPr>
           <w:rFonts w:ascii="Arial" w:hAnsi="Arial" w:cs="Arial"/>
         </w:rPr>
         <w:t>others_protected</w:t>
       </w:r>
+      <w:proofErr w:type="spellEnd"/>
+      <w:r>
+        <w:rPr>
+          <w:rFonts w:ascii="Arial" w:hAnsi="Arial" w:cs="Arial"/>
+        </w:rPr>
+        <w:t xml:space="preserve"> </w:t>
+      </w:r>
+      <w:proofErr w:type="gramStart"/>
+      <w:r>
+        <w:rPr>
+          <w:rFonts w:ascii="Arial" w:hAnsi="Arial" w:cs="Arial"/>
+        </w:rPr>
+        <w:t>%}</w:t>
+      </w:r>
+      <w:r>
+        <w:rPr>
+          <w:rFonts w:ascii="Arial" w:hAnsi="Arial" w:cs="Arial"/>
+        </w:rPr>
+        <w:t>{</w:t>
+      </w:r>
+      <w:proofErr w:type="gramEnd"/>
+      <w:r>
+        <w:rPr>
+          <w:rFonts w:ascii="Arial" w:hAnsi="Arial" w:cs="Arial"/>
+        </w:rPr>
+        <w:t xml:space="preserve">% if </w:t>
+      </w:r>
+      <w:proofErr w:type="spellStart"/>
+      <w:proofErr w:type="gramStart"/>
+      <w:r>
+        <w:rPr>
+          <w:rFonts w:ascii="Arial" w:hAnsi="Arial" w:cs="Arial"/>
+        </w:rPr>
+        <w:t>person.include</w:t>
+      </w:r>
+      <w:proofErr w:type="gramEnd"/>
+      <w:r>
+        <w:rPr>
+          <w:rFonts w:ascii="Arial" w:hAnsi="Arial" w:cs="Arial"/>
+        </w:rPr>
+        <w:t>_in_addendum</w:t>
+      </w:r>
+      <w:proofErr w:type="spellEnd"/>
+      <w:r>
+        <w:rPr>
+          <w:rFonts w:ascii="Arial" w:hAnsi="Arial" w:cs="Arial"/>
+        </w:rPr>
+        <w:t xml:space="preserve"> == </w:t>
+      </w:r>
+      <w:proofErr w:type="gramStart"/>
+      <w:r>
+        <w:rPr>
+          <w:rFonts w:ascii="Arial" w:hAnsi="Arial" w:cs="Arial"/>
+        </w:rPr>
+        <w:t>True</w:t>
+      </w:r>
       <w:r>
         <w:rPr>
           <w:rFonts w:ascii="Arial" w:hAnsi="Arial" w:cs="Arial"/>
         </w:rPr>
         <w:t xml:space="preserve"> %}</w:t>
       </w:r>
-      <w:r>
-        <w:rPr>
-          <w:rFonts w:ascii="Arial" w:hAnsi="Arial" w:cs="Arial"/>
-        </w:rPr>
-        <w:t xml:space="preserve">{% if </w:t>
-      </w:r>
-      <w:r>
-        <w:rPr>
-          <w:rFonts w:ascii="Arial" w:hAnsi="Arial" w:cs="Arial"/>
-        </w:rPr>
-        <w:t>person.include_in_addendum == True</w:t>
-      </w:r>
-      <w:r>
-        <w:rPr>
-          <w:rFonts w:ascii="Arial" w:hAnsi="Arial" w:cs="Arial"/>
-        </w:rPr>
-        <w:t xml:space="preserve"> %}</w:t>
-      </w:r>
+      <w:proofErr w:type="gramEnd"/>
     </w:p>
     <w:tbl>
       <w:tblPr>
@@ -364,7 +558,27 @@
                 <w:sz w:val="22"/>
                 <w:szCs w:val="22"/>
               </w:rPr>
-              <w:t>{{person.name.full(middle=’full’)}}</w:t>
+              <w:t>{{</w:t>
+            </w:r>
+            <w:proofErr w:type="spellStart"/>
+            <w:proofErr w:type="gramStart"/>
+            <w:r>
+              <w:rPr>
+                <w:rFonts w:ascii="Arial" w:hAnsi="Arial" w:cs="Arial"/>
+                <w:sz w:val="22"/>
+                <w:szCs w:val="22"/>
+              </w:rPr>
+              <w:t>person.name.full</w:t>
+            </w:r>
+            <w:proofErr w:type="spellEnd"/>
+            <w:proofErr w:type="gramEnd"/>
+            <w:r>
+              <w:rPr>
+                <w:rFonts w:ascii="Arial" w:hAnsi="Arial" w:cs="Arial"/>
+                <w:sz w:val="22"/>
+                <w:szCs w:val="22"/>
+              </w:rPr>
+              <w:t>(middle=’full’)}}</w:t>
             </w:r>
           </w:p>
         </w:tc>
@@ -388,21 +602,41 @@
               </w:rPr>
               <w:t xml:space="preserve">{% if </w:t>
             </w:r>
-            <w:r>
-              <w:rPr>
-                <w:rFonts w:ascii="Arial" w:hAnsi="Arial" w:cs="Arial"/>
-                <w:sz w:val="22"/>
-                <w:szCs w:val="22"/>
-              </w:rPr>
-              <w:t xml:space="preserve">hide_address == True and </w:t>
-            </w:r>
-            <w:r>
-              <w:rPr>
-                <w:rFonts w:ascii="Arial" w:hAnsi="Arial" w:cs="Arial"/>
-                <w:sz w:val="22"/>
-                <w:szCs w:val="22"/>
-              </w:rPr>
-              <w:t xml:space="preserve">person.use_safe_address </w:t>
+            <w:proofErr w:type="spellStart"/>
+            <w:r>
+              <w:rPr>
+                <w:rFonts w:ascii="Arial" w:hAnsi="Arial" w:cs="Arial"/>
+                <w:sz w:val="22"/>
+                <w:szCs w:val="22"/>
+              </w:rPr>
+              <w:t>hide_address</w:t>
+            </w:r>
+            <w:proofErr w:type="spellEnd"/>
+            <w:r>
+              <w:rPr>
+                <w:rFonts w:ascii="Arial" w:hAnsi="Arial" w:cs="Arial"/>
+                <w:sz w:val="22"/>
+                <w:szCs w:val="22"/>
+              </w:rPr>
+              <w:t xml:space="preserve"> == True and </w:t>
+            </w:r>
+            <w:proofErr w:type="spellStart"/>
+            <w:r>
+              <w:rPr>
+                <w:rFonts w:ascii="Arial" w:hAnsi="Arial" w:cs="Arial"/>
+                <w:sz w:val="22"/>
+                <w:szCs w:val="22"/>
+              </w:rPr>
+              <w:t>person.use_safe_address</w:t>
+            </w:r>
+            <w:proofErr w:type="spellEnd"/>
+            <w:r>
+              <w:rPr>
+                <w:rFonts w:ascii="Arial" w:hAnsi="Arial" w:cs="Arial"/>
+                <w:sz w:val="22"/>
+                <w:szCs w:val="22"/>
+              </w:rPr>
+              <w:t xml:space="preserve"> </w:t>
             </w:r>
             <w:r>
               <w:rPr>
@@ -412,6 +646,7 @@
               </w:rPr>
               <w:t xml:space="preserve">== True </w:t>
             </w:r>
+            <w:proofErr w:type="gramStart"/>
             <w:r>
               <w:rPr>
                 <w:rFonts w:ascii="Arial" w:hAnsi="Arial" w:cs="Arial"/>
@@ -420,21 +655,76 @@
               </w:rPr>
               <w:t>%}{</w:t>
             </w:r>
-            <w:r>
-              <w:rPr>
-                <w:rFonts w:ascii="Arial" w:hAnsi="Arial" w:cs="Arial"/>
-                <w:sz w:val="22"/>
-                <w:szCs w:val="22"/>
-              </w:rPr>
-              <w:t>{users[0].address.on_one_line(bare=True)}</w:t>
-            </w:r>
-            <w:r>
-              <w:rPr>
-                <w:rFonts w:ascii="Arial" w:hAnsi="Arial" w:cs="Arial"/>
-                <w:sz w:val="22"/>
-                <w:szCs w:val="22"/>
-              </w:rPr>
-              <w:t xml:space="preserve">}{% </w:t>
+            <w:proofErr w:type="gramEnd"/>
+            <w:r>
+              <w:rPr>
+                <w:rFonts w:ascii="Arial" w:hAnsi="Arial" w:cs="Arial"/>
+                <w:sz w:val="22"/>
+                <w:szCs w:val="22"/>
+              </w:rPr>
+              <w:t>{users[0</w:t>
+            </w:r>
+            <w:proofErr w:type="gramStart"/>
+            <w:r>
+              <w:rPr>
+                <w:rFonts w:ascii="Arial" w:hAnsi="Arial" w:cs="Arial"/>
+                <w:sz w:val="22"/>
+                <w:szCs w:val="22"/>
+              </w:rPr>
+              <w:t>].</w:t>
+            </w:r>
+            <w:proofErr w:type="spellStart"/>
+            <w:r>
+              <w:rPr>
+                <w:rFonts w:ascii="Arial" w:hAnsi="Arial" w:cs="Arial"/>
+                <w:sz w:val="22"/>
+                <w:szCs w:val="22"/>
+              </w:rPr>
+              <w:t>address</w:t>
+            </w:r>
+            <w:proofErr w:type="gramEnd"/>
+            <w:r>
+              <w:rPr>
+                <w:rFonts w:ascii="Arial" w:hAnsi="Arial" w:cs="Arial"/>
+                <w:sz w:val="22"/>
+                <w:szCs w:val="22"/>
+              </w:rPr>
+              <w:t>.on_one_line</w:t>
+            </w:r>
+            <w:proofErr w:type="spellEnd"/>
+            <w:r>
+              <w:rPr>
+                <w:rFonts w:ascii="Arial" w:hAnsi="Arial" w:cs="Arial"/>
+                <w:sz w:val="22"/>
+                <w:szCs w:val="22"/>
+              </w:rPr>
+              <w:t>(bare=True)</w:t>
+            </w:r>
+            <w:proofErr w:type="gramStart"/>
+            <w:r>
+              <w:rPr>
+                <w:rFonts w:ascii="Arial" w:hAnsi="Arial" w:cs="Arial"/>
+                <w:sz w:val="22"/>
+                <w:szCs w:val="22"/>
+              </w:rPr>
+              <w:t>}</w:t>
+            </w:r>
+            <w:r>
+              <w:rPr>
+                <w:rFonts w:ascii="Arial" w:hAnsi="Arial" w:cs="Arial"/>
+                <w:sz w:val="22"/>
+                <w:szCs w:val="22"/>
+              </w:rPr>
+              <w:t>}{</w:t>
+            </w:r>
+            <w:proofErr w:type="gramEnd"/>
+            <w:r>
+              <w:rPr>
+                <w:rFonts w:ascii="Arial" w:hAnsi="Arial" w:cs="Arial"/>
+                <w:sz w:val="22"/>
+                <w:szCs w:val="22"/>
+              </w:rPr>
+              <w:t xml:space="preserve">% </w:t>
             </w:r>
             <w:r>
               <w:rPr>
@@ -452,6 +742,7 @@
               </w:rPr>
               <w:t xml:space="preserve"> </w:t>
             </w:r>
+            <w:proofErr w:type="gramStart"/>
             <w:r>
               <w:rPr>
                 <w:rFonts w:ascii="Arial" w:hAnsi="Arial" w:cs="Arial"/>
@@ -466,23 +757,62 @@
                 <w:sz w:val="22"/>
                 <w:szCs w:val="22"/>
               </w:rPr>
-              <w:t>{% if person.address</w:t>
-            </w:r>
-            <w:r>
-              <w:rPr>
-                <w:rFonts w:ascii="Arial" w:hAnsi="Arial" w:cs="Arial"/>
-                <w:sz w:val="22"/>
-                <w:szCs w:val="22"/>
-              </w:rPr>
-              <w:t>.address</w:t>
-            </w:r>
-            <w:r>
-              <w:rPr>
-                <w:rFonts w:ascii="Arial" w:hAnsi="Arial" w:cs="Arial"/>
-                <w:sz w:val="22"/>
-                <w:szCs w:val="22"/>
-              </w:rPr>
-              <w:t xml:space="preserve"> != </w:t>
+              <w:t>{</w:t>
+            </w:r>
+            <w:proofErr w:type="gramEnd"/>
+            <w:r>
+              <w:rPr>
+                <w:rFonts w:ascii="Arial" w:hAnsi="Arial" w:cs="Arial"/>
+                <w:sz w:val="22"/>
+                <w:szCs w:val="22"/>
+              </w:rPr>
+              <w:t xml:space="preserve">% if </w:t>
+            </w:r>
+            <w:proofErr w:type="spellStart"/>
+            <w:proofErr w:type="gramStart"/>
+            <w:r>
+              <w:rPr>
+                <w:rFonts w:ascii="Arial" w:hAnsi="Arial" w:cs="Arial"/>
+                <w:sz w:val="22"/>
+                <w:szCs w:val="22"/>
+              </w:rPr>
+              <w:t>person.address</w:t>
+            </w:r>
+            <w:proofErr w:type="gramEnd"/>
+            <w:r>
+              <w:rPr>
+                <w:rFonts w:ascii="Arial" w:hAnsi="Arial" w:cs="Arial"/>
+                <w:sz w:val="22"/>
+                <w:szCs w:val="22"/>
+              </w:rPr>
+              <w:t>.</w:t>
+            </w:r>
+            <w:proofErr w:type="gramStart"/>
+            <w:r>
+              <w:rPr>
+                <w:rFonts w:ascii="Arial" w:hAnsi="Arial" w:cs="Arial"/>
+                <w:sz w:val="22"/>
+                <w:szCs w:val="22"/>
+              </w:rPr>
+              <w:t>address</w:t>
+            </w:r>
+            <w:proofErr w:type="spellEnd"/>
+            <w:r>
+              <w:rPr>
+                <w:rFonts w:ascii="Arial" w:hAnsi="Arial" w:cs="Arial"/>
+                <w:sz w:val="22"/>
+                <w:szCs w:val="22"/>
+              </w:rPr>
+              <w:t xml:space="preserve"> !</w:t>
+            </w:r>
+            <w:proofErr w:type="gramEnd"/>
+            <w:r>
+              <w:rPr>
+                <w:rFonts w:ascii="Arial" w:hAnsi="Arial" w:cs="Arial"/>
+                <w:sz w:val="22"/>
+                <w:szCs w:val="22"/>
+              </w:rPr>
+              <w:t xml:space="preserve">= </w:t>
             </w:r>
             <w:r>
               <w:rPr>
@@ -498,7 +828,16 @@
                 <w:sz w:val="22"/>
                 <w:szCs w:val="22"/>
               </w:rPr>
-              <w:t xml:space="preserve"> %</w:t>
+              <w:t xml:space="preserve"> </w:t>
+            </w:r>
+            <w:proofErr w:type="gramStart"/>
+            <w:r>
+              <w:rPr>
+                <w:rFonts w:ascii="Arial" w:hAnsi="Arial" w:cs="Arial"/>
+                <w:sz w:val="22"/>
+                <w:szCs w:val="22"/>
+              </w:rPr>
+              <w:t>%</w:t>
             </w:r>
             <w:r>
               <w:rPr>
@@ -514,15 +853,44 @@
                 <w:sz w:val="22"/>
                 <w:szCs w:val="22"/>
               </w:rPr>
-              <w:t>{{</w:t>
-            </w:r>
-            <w:r>
-              <w:rPr>
-                <w:rFonts w:ascii="Arial" w:hAnsi="Arial" w:cs="Arial"/>
-                <w:sz w:val="22"/>
-                <w:szCs w:val="22"/>
-              </w:rPr>
-              <w:t>person.address.on_one_line(</w:t>
+              <w:t>{</w:t>
+            </w:r>
+            <w:proofErr w:type="gramEnd"/>
+            <w:r>
+              <w:rPr>
+                <w:rFonts w:ascii="Arial" w:hAnsi="Arial" w:cs="Arial"/>
+                <w:sz w:val="22"/>
+                <w:szCs w:val="22"/>
+              </w:rPr>
+              <w:t>{</w:t>
+            </w:r>
+            <w:proofErr w:type="spellStart"/>
+            <w:proofErr w:type="gramStart"/>
+            <w:r>
+              <w:rPr>
+                <w:rFonts w:ascii="Arial" w:hAnsi="Arial" w:cs="Arial"/>
+                <w:sz w:val="22"/>
+                <w:szCs w:val="22"/>
+              </w:rPr>
+              <w:t>person.address</w:t>
+            </w:r>
+            <w:proofErr w:type="gramEnd"/>
+            <w:r>
+              <w:rPr>
+                <w:rFonts w:ascii="Arial" w:hAnsi="Arial" w:cs="Arial"/>
+                <w:sz w:val="22"/>
+                <w:szCs w:val="22"/>
+              </w:rPr>
+              <w:t>.on_one_line</w:t>
+            </w:r>
+            <w:proofErr w:type="spellEnd"/>
+            <w:r>
+              <w:rPr>
+                <w:rFonts w:ascii="Arial" w:hAnsi="Arial" w:cs="Arial"/>
+                <w:sz w:val="22"/>
+                <w:szCs w:val="22"/>
+              </w:rPr>
+              <w:t>(</w:t>
             </w:r>
             <w:r>
               <w:rPr>
@@ -539,23 +907,59 @@
                 <w:sz w:val="22"/>
                 <w:szCs w:val="22"/>
               </w:rPr>
-              <w:t>)}}</w:t>
-            </w:r>
-            <w:r>
-              <w:rPr>
-                <w:rFonts w:ascii="Arial" w:hAnsi="Arial" w:cs="Arial"/>
-                <w:sz w:val="22"/>
-                <w:szCs w:val="22"/>
-              </w:rPr>
-              <w:t>{% endif %}</w:t>
-            </w:r>
-            <w:r>
-              <w:rPr>
-                <w:rFonts w:ascii="Arial" w:hAnsi="Arial" w:cs="Arial"/>
-                <w:sz w:val="22"/>
-                <w:szCs w:val="22"/>
-              </w:rPr>
-              <w:t>{% endif %}</w:t>
+              <w:t>)</w:t>
+            </w:r>
+            <w:proofErr w:type="gramStart"/>
+            <w:r>
+              <w:rPr>
+                <w:rFonts w:ascii="Arial" w:hAnsi="Arial" w:cs="Arial"/>
+                <w:sz w:val="22"/>
+                <w:szCs w:val="22"/>
+              </w:rPr>
+              <w:t>}}</w:t>
+            </w:r>
+            <w:r>
+              <w:rPr>
+                <w:rFonts w:ascii="Arial" w:hAnsi="Arial" w:cs="Arial"/>
+                <w:sz w:val="22"/>
+                <w:szCs w:val="22"/>
+              </w:rPr>
+              <w:t>{</w:t>
+            </w:r>
+            <w:proofErr w:type="gramEnd"/>
+            <w:r>
+              <w:rPr>
+                <w:rFonts w:ascii="Arial" w:hAnsi="Arial" w:cs="Arial"/>
+                <w:sz w:val="22"/>
+                <w:szCs w:val="22"/>
+              </w:rPr>
+              <w:t xml:space="preserve">% endif </w:t>
+            </w:r>
+            <w:proofErr w:type="gramStart"/>
+            <w:r>
+              <w:rPr>
+                <w:rFonts w:ascii="Arial" w:hAnsi="Arial" w:cs="Arial"/>
+                <w:sz w:val="22"/>
+                <w:szCs w:val="22"/>
+              </w:rPr>
+              <w:t>%}</w:t>
+            </w:r>
+            <w:r>
+              <w:rPr>
+                <w:rFonts w:ascii="Arial" w:hAnsi="Arial" w:cs="Arial"/>
+                <w:sz w:val="22"/>
+                <w:szCs w:val="22"/>
+              </w:rPr>
+              <w:t>{</w:t>
+            </w:r>
+            <w:proofErr w:type="gramEnd"/>
+            <w:r>
+              <w:rPr>
+                <w:rFonts w:ascii="Arial" w:hAnsi="Arial" w:cs="Arial"/>
+                <w:sz w:val="22"/>
+                <w:szCs w:val="22"/>
+              </w:rPr>
+              <w:t>% endif %}</w:t>
             </w:r>
           </w:p>
         </w:tc>
@@ -571,14 +975,44 @@
         <w:rPr>
           <w:rFonts w:ascii="Arial" w:hAnsi="Arial" w:cs="Arial"/>
         </w:rPr>
-        <w:t>{% endif %}</w:t>
-      </w:r>
-      <w:r>
-        <w:rPr>
-          <w:rFonts w:ascii="Arial" w:hAnsi="Arial" w:cs="Arial"/>
-        </w:rPr>
-        <w:t>{% endfor %}</w:t>
-      </w:r>
+        <w:t xml:space="preserve">{% endif </w:t>
+      </w:r>
+      <w:proofErr w:type="gramStart"/>
+      <w:r>
+        <w:rPr>
+          <w:rFonts w:ascii="Arial" w:hAnsi="Arial" w:cs="Arial"/>
+        </w:rPr>
+        <w:t>%}</w:t>
+      </w:r>
+      <w:r>
+        <w:rPr>
+          <w:rFonts w:ascii="Arial" w:hAnsi="Arial" w:cs="Arial"/>
+        </w:rPr>
+        <w:t>{</w:t>
+      </w:r>
+      <w:proofErr w:type="gramEnd"/>
+      <w:r>
+        <w:rPr>
+          <w:rFonts w:ascii="Arial" w:hAnsi="Arial" w:cs="Arial"/>
+        </w:rPr>
+        <w:t xml:space="preserve">% </w:t>
+      </w:r>
+      <w:proofErr w:type="spellStart"/>
+      <w:proofErr w:type="gramStart"/>
+      <w:r>
+        <w:rPr>
+          <w:rFonts w:ascii="Arial" w:hAnsi="Arial" w:cs="Arial"/>
+        </w:rPr>
+        <w:t>endfor</w:t>
+      </w:r>
+      <w:proofErr w:type="spellEnd"/>
+      <w:r>
+        <w:rPr>
+          <w:rFonts w:ascii="Arial" w:hAnsi="Arial" w:cs="Arial"/>
+        </w:rPr>
+        <w:t xml:space="preserve"> %}</w:t>
+      </w:r>
+      <w:proofErr w:type="gramEnd"/>
     </w:p>
     <w:p>
       <w:pPr>

</xml_diff>